<commit_message>
Refactored the design of Employee Master page to renposive when viewed in mobile devices
</commit_message>
<xml_diff>
--- a/Documentation/Technical Specifications/KEN HR Solutions - Technical Notes.docx
+++ b/Documentation/Technical Specifications/KEN HR Solutions - Technical Notes.docx
@@ -472,6 +472,50 @@
         <w:t>Background Color: #004165</w:t>
       </w:r>
     </w:p>
+    <w:p>
+      <w:proofErr w:type="spellStart"/>
+      <w:r>
+        <w:rPr>
+          <w:b/>
+          <w:bCs/>
+        </w:rPr>
+        <w:t>KenSolutions</w:t>
+      </w:r>
+      <w:proofErr w:type="spellEnd"/>
+      <w:r>
+        <w:rPr>
+          <w:b/>
+          <w:bCs/>
+        </w:rPr>
+        <w:t xml:space="preserve"> Repository URL:</w:t>
+      </w:r>
+      <w:r>
+        <w:t xml:space="preserve"> </w:t>
+      </w:r>
+      <w:hyperlink r:id="rId7" w:history="1">
+        <w:r>
+          <w:rPr>
+            <w:rStyle w:val="Hyperlink"/>
+          </w:rPr>
+          <w:t>https://github.com/eb</w:t>
+        </w:r>
+        <w:r>
+          <w:rPr>
+            <w:rStyle w:val="Hyperlink"/>
+          </w:rPr>
+          <w:t>r</w:t>
+        </w:r>
+        <w:r>
+          <w:rPr>
+            <w:rStyle w:val="Hyperlink"/>
+          </w:rPr>
+          <w:t>osas/KENSolutions/tree/master</w:t>
+        </w:r>
+      </w:hyperlink>
+      <w:r>
+        <w:t xml:space="preserve">  </w:t>
+      </w:r>
+    </w:p>
     <w:p/>
     <w:p>
       <w:pPr>
@@ -501,7 +545,7 @@
       <w:r>
         <w:t xml:space="preserve">URL: </w:t>
       </w:r>
-      <w:hyperlink r:id="rId7" w:history="1">
+      <w:hyperlink r:id="rId8" w:history="1">
         <w:r>
           <w:rPr>
             <w:rStyle w:val="Hyperlink"/>
@@ -2110,6 +2154,7 @@
   <w:style w:type="character" w:default="1" w:styleId="DefaultParagraphFont">
     <w:name w:val="Default Paragraph Font"/>
     <w:uiPriority w:val="1"/>
+    <w:semiHidden/>
     <w:unhideWhenUsed/>
   </w:style>
   <w:style w:type="table" w:default="1" w:styleId="TableNormal">
@@ -2444,6 +2489,18 @@
     <w:rPr>
       <w:color w:val="605E5C"/>
       <w:shd w:val="clear" w:color="auto" w:fill="E1DFDD"/>
+    </w:rPr>
+  </w:style>
+  <w:style w:type="character" w:styleId="FollowedHyperlink">
+    <w:name w:val="FollowedHyperlink"/>
+    <w:basedOn w:val="DefaultParagraphFont"/>
+    <w:uiPriority w:val="99"/>
+    <w:semiHidden/>
+    <w:unhideWhenUsed/>
+    <w:rsid w:val="00000A96"/>
+    <w:rPr>
+      <w:color w:val="954F72" w:themeColor="followedHyperlink"/>
+      <w:u w:val="single"/>
     </w:rPr>
   </w:style>
 </w:styles>

</xml_diff>

<commit_message>
Checked in technical notes document
</commit_message>
<xml_diff>
--- a/Documentation/Technical Specifications/KEN HR Solutions - Technical Notes.docx
+++ b/Documentation/Technical Specifications/KEN HR Solutions - Technical Notes.docx
@@ -497,19 +497,7 @@
           <w:rPr>
             <w:rStyle w:val="Hyperlink"/>
           </w:rPr>
-          <w:t>https://github.com/eb</w:t>
-        </w:r>
-        <w:r>
-          <w:rPr>
-            <w:rStyle w:val="Hyperlink"/>
-          </w:rPr>
-          <w:t>r</w:t>
-        </w:r>
-        <w:r>
-          <w:rPr>
-            <w:rStyle w:val="Hyperlink"/>
-          </w:rPr>
-          <w:t>osas/KENSolutions/tree/master</w:t>
+          <w:t>https://github.com/ebrosas/KENSolutions/tree/master</w:t>
         </w:r>
       </w:hyperlink>
       <w:r>
@@ -567,6 +555,77 @@
         <w:t>Password: Testing@45</w:t>
       </w:r>
     </w:p>
+    <w:p>
+      <w:pPr>
+        <w:rPr>
+          <w:b/>
+          <w:bCs/>
+          <w:u w:val="single"/>
+        </w:rPr>
+      </w:pPr>
+      <w:proofErr w:type="spellStart"/>
+      <w:r>
+        <w:rPr>
+          <w:b/>
+          <w:bCs/>
+          <w:u w:val="single"/>
+        </w:rPr>
+        <w:t>KenHR</w:t>
+      </w:r>
+      <w:proofErr w:type="spellEnd"/>
+      <w:r>
+        <w:rPr>
+          <w:b/>
+          <w:bCs/>
+          <w:u w:val="single"/>
+        </w:rPr>
+        <w:t xml:space="preserve"> Login Credentials:</w:t>
+      </w:r>
+    </w:p>
+    <w:p>
+      <w:r>
+        <w:t>Khalid:</w:t>
+      </w:r>
+    </w:p>
+    <w:p>
+      <w:r>
+        <w:t xml:space="preserve">User ID: </w:t>
+      </w:r>
+      <w:proofErr w:type="spellStart"/>
+      <w:r>
+        <w:t>kjalal</w:t>
+      </w:r>
+      <w:proofErr w:type="spellEnd"/>
+    </w:p>
+    <w:p>
+      <w:r>
+        <w:t>Password: Kenhr@123</w:t>
+      </w:r>
+    </w:p>
+    <w:p>
+      <w:r>
+        <w:t>Naga</w:t>
+      </w:r>
+      <w:r>
+        <w:t>:</w:t>
+      </w:r>
+    </w:p>
+    <w:p>
+      <w:r>
+        <w:t xml:space="preserve">User ID: </w:t>
+      </w:r>
+      <w:proofErr w:type="spellStart"/>
+      <w:r>
+        <w:t>nagendra</w:t>
+      </w:r>
+      <w:proofErr w:type="spellEnd"/>
+    </w:p>
+    <w:p>
+      <w:r>
+        <w:t>Password: Kenhr@123</w:t>
+      </w:r>
+    </w:p>
+    <w:p/>
     <w:p>
       <w:pPr>
         <w:pStyle w:val="ListParagraph"/>

</xml_diff>